<commit_message>
Added subscriber queues and threads
</commit_message>
<xml_diff>
--- a/pub sub teze.docx
+++ b/pub sub teze.docx
@@ -196,6 +196,9 @@
         </w:numPr>
       </w:pPr>
       <w:r>
+        <w:rPr>
+          <w:noProof/>
+        </w:rPr>
         <w:drawing>
           <wp:inline distT="0" distB="0" distL="0" distR="0" wp14:anchorId="1DA3D01D" wp14:editId="0E98172F">
             <wp:extent cx="1798320" cy="2491999"/>
@@ -305,6 +308,9 @@
         </w:numPr>
       </w:pPr>
       <w:r>
+        <w:rPr>
+          <w:noProof/>
+        </w:rPr>
         <w:drawing>
           <wp:inline distT="0" distB="0" distL="0" distR="0" wp14:anchorId="3BBEF517" wp14:editId="1D100789">
             <wp:extent cx="2658533" cy="2984033"/>
@@ -363,6 +369,9 @@
         </w:numPr>
       </w:pPr>
       <w:r>
+        <w:rPr>
+          <w:noProof/>
+        </w:rPr>
         <w:drawing>
           <wp:inline distT="0" distB="0" distL="0" distR="0" wp14:anchorId="392DC768" wp14:editId="09C368B9">
             <wp:extent cx="2463577" cy="4047067"/>
@@ -498,8 +507,6 @@
       <w:r>
         <w:t xml:space="preserve">nit koja se pretplacuje na temu npr 5 i posalji svima koji su pretplaceni na tu temu </w:t>
       </w:r>
-      <w:bookmarkStart w:id="0" w:name="_GoBack"/>
-      <w:bookmarkEnd w:id="0"/>
     </w:p>
     <w:p/>
     <w:p/>
@@ -575,6 +582,61 @@
       <w:r>
         <w:t>Action&lt; int, string&gt; - metoda koja prima 2 parametra</w:t>
       </w:r>
+    </w:p>
+    <w:p/>
+    <w:p/>
+    <w:p>
+      <w:pPr>
+        <w:pStyle w:val="ListParagraph"/>
+        <w:numPr>
+          <w:ilvl w:val="0"/>
+          <w:numId w:val="1"/>
+        </w:numPr>
+      </w:pPr>
+      <w:r>
+        <w:t>Problem:</w:t>
+      </w:r>
+    </w:p>
+    <w:p>
+      <w:pPr>
+        <w:pStyle w:val="ListParagraph"/>
+        <w:numPr>
+          <w:ilvl w:val="0"/>
+          <w:numId w:val="1"/>
+        </w:numPr>
+      </w:pPr>
+      <w:r>
+        <w:t xml:space="preserve">Subscriber moze NE MOZE istom brzinom da obradjuje </w:t>
+      </w:r>
+    </w:p>
+    <w:p>
+      <w:pPr>
+        <w:pStyle w:val="ListParagraph"/>
+        <w:numPr>
+          <w:ilvl w:val="0"/>
+          <w:numId w:val="1"/>
+        </w:numPr>
+      </w:pPr>
+      <w:r>
+        <w:t xml:space="preserve">Neki subscriberi ce biti na sproijoj mrezi, neki ce biti van mreze </w:t>
+      </w:r>
+    </w:p>
+    <w:p>
+      <w:pPr>
+        <w:pStyle w:val="ListParagraph"/>
+        <w:numPr>
+          <w:ilvl w:val="0"/>
+          <w:numId w:val="1"/>
+        </w:numPr>
+      </w:pPr>
+      <w:r>
+        <w:t xml:space="preserve">Trebalo bi -  za svakog subsribers imam poseban red sa kog on dobija podatke </w:t>
+      </w:r>
+      <w:r>
+        <w:t xml:space="preserve">– i obezbediti sinhornizaciju </w:t>
+      </w:r>
+      <w:bookmarkStart w:id="0" w:name="_GoBack"/>
+      <w:bookmarkEnd w:id="0"/>
     </w:p>
     <w:sectPr>
       <w:pgSz w:w="12240" w:h="15840"/>

</xml_diff>